<commit_message>
Update Readme, mixing model code
</commit_message>
<xml_diff>
--- a/Bayesian_Code/Readme.docx
+++ b/Bayesian_Code/Readme.docx
@@ -16,10 +16,22 @@
     <w:p/>
     <w:p>
       <w:r>
-        <w:t xml:space="preserve">The mixing models are R Markdown files. </w:t>
-      </w:r>
-      <w:r>
-        <w:t xml:space="preserve">It was created and tested in R version 4.2.2 (2022-10-31). Packages required are in the first chunk, which can be installed via </w:t>
+        <w:t xml:space="preserve">To run this code, JAGS needs to be downloaded and installed from </w:t>
+      </w:r>
+      <w:hyperlink r:id="rId4" w:tgtFrame="_blank" w:history="1">
+        <w:r>
+          <w:rPr>
+            <w:rStyle w:val="Hyperlink"/>
+            <w:rFonts w:ascii="Arial" w:hAnsi="Arial" w:cs="Arial"/>
+            <w:color w:val="1155CC"/>
+            <w:sz w:val="22"/>
+            <w:szCs w:val="22"/>
+          </w:rPr>
+          <w:t>https://sourceforge.net/projects/mcmc-jags/files/</w:t>
+        </w:r>
+      </w:hyperlink>
+      <w:r>
+        <w:t xml:space="preserve">. Follow to this link, download the latest version, and run the downloaded file. After that, necessary packages in R can be installed using the </w:t>
       </w:r>
       <w:proofErr w:type="spellStart"/>
       <w:r>
@@ -27,12 +39,53 @@
       </w:r>
       <w:proofErr w:type="spellEnd"/>
       <w:r>
-        <w:t>(). Installation of packages should take less than 10 minutes if none have been installed.</w:t>
+        <w:t>(</w:t>
+      </w:r>
+      <w:r>
+        <w:t>…</w:t>
+      </w:r>
+      <w:r>
+        <w:t>)</w:t>
+      </w:r>
+      <w:r>
+        <w:t xml:space="preserve"> command as normal. </w:t>
       </w:r>
     </w:p>
     <w:p/>
     <w:p>
       <w:r>
+        <w:t xml:space="preserve">The mixing models are R Markdown files. </w:t>
+      </w:r>
+      <w:r>
+        <w:t>It was created and tested in R version 4.2.2 (2022-10-31)</w:t>
+      </w:r>
+      <w:r>
+        <w:t xml:space="preserve"> on macOS Ventura </w:t>
+      </w:r>
+      <w:r>
+        <w:t>ve</w:t>
+      </w:r>
+      <w:r>
+        <w:t>rsion 13.0.1</w:t>
+      </w:r>
+      <w:r>
+        <w:t xml:space="preserve">, R version 4.4.0 on macOS 15.5, and R version 4.4.1 on Windows 11 Pro. </w:t>
+      </w:r>
+      <w:r>
+        <w:t xml:space="preserve">Packages required are in the first chunk, which can be installed via </w:t>
+      </w:r>
+      <w:proofErr w:type="spellStart"/>
+      <w:r>
+        <w:t>install.packages</w:t>
+      </w:r>
+      <w:proofErr w:type="spellEnd"/>
+      <w:r>
+        <w:t>(). Installation of packages should take less than 10 minutes if none have been installed.</w:t>
+      </w:r>
+    </w:p>
+    <w:p/>
+    <w:p>
+      <w:r>
         <w:t>As long as the packages in the first setup chunk are installed, you should be able to click “Knit” and it will run without any changes necessary. If it has an error in the setup chunk involving the “</w:t>
       </w:r>
       <w:proofErr w:type="spellStart"/>
@@ -109,7 +162,11 @@
     </w:p>
     <w:p>
       <w:r>
-        <w:t>When the demo is knit, it will create 2 folder, ending with _cache and _files, as well as producing an .html output. You can view the .html to see the Particle Source as in Fig S2. Diagnostics are also included to make sure the chains are behaving properly. Further diagnostics were removed from the demo for ease of running and reduction in time.</w:t>
+        <w:t xml:space="preserve">When the demo is knit, it will create 2 folder, ending with _cache and _files, as well as producing an .html output. You can view the .html to see the Particle Source as in Fig S2. </w:t>
+      </w:r>
+      <w:r>
+        <w:lastRenderedPageBreak/>
+        <w:t>Diagnostics are also included to make sure the chains are behaving properly. Further diagnostics were removed from the demo for ease of running and reduction in time.</w:t>
       </w:r>
     </w:p>
     <w:p>
@@ -151,11 +208,7 @@
       </w:r>
       <w:proofErr w:type="spellEnd"/>
       <w:r>
-        <w:t xml:space="preserve">, Data_10_Fall; already split so excess </w:t>
-      </w:r>
-      <w:r>
-        <w:lastRenderedPageBreak/>
-        <w:t>filtering of data is not needed in code), and Mean Contribution data (</w:t>
+        <w:t>, Data_10_Fall; already split so excess filtering of data is not needed in code), and Mean Contribution data (</w:t>
       </w:r>
       <w:proofErr w:type="spellStart"/>
       <w:r>
@@ -1134,6 +1187,18 @@
       <w:spacing w:val="5"/>
     </w:rPr>
   </w:style>
+  <w:style w:type="character" w:styleId="Hyperlink">
+    <w:name w:val="Hyperlink"/>
+    <w:basedOn w:val="DefaultParagraphFont"/>
+    <w:uiPriority w:val="99"/>
+    <w:semiHidden/>
+    <w:unhideWhenUsed/>
+    <w:rsid w:val="00E37831"/>
+    <w:rPr>
+      <w:color w:val="0000FF"/>
+      <w:u w:val="single"/>
+    </w:rPr>
+  </w:style>
 </w:styles>
 </file>
 

</xml_diff>